<commit_message>
Pruebas, Cierre de proyecto y Prototipo
</commit_message>
<xml_diff>
--- a/Avance de Proyecto/PMOInformatica Modelo de Estudio de factibilidad.docx
+++ b/Avance de Proyecto/PMOInformatica Modelo de Estudio de factibilidad.docx
@@ -910,7 +910,7 @@
         <w:rPr>
           <w:noProof/>
         </w:rPr>
-        <w:t>7</w:t>
+        <w:t>9</w:t>
       </w:r>
       <w:r>
         <w:rPr>
@@ -968,7 +968,7 @@
         <w:rPr>
           <w:noProof/>
         </w:rPr>
-        <w:t>8</w:t>
+        <w:t>10</w:t>
       </w:r>
       <w:r>
         <w:rPr>
@@ -1026,7 +1026,7 @@
         <w:rPr>
           <w:noProof/>
         </w:rPr>
-        <w:t>9</w:t>
+        <w:t>13</w:t>
       </w:r>
       <w:r>
         <w:rPr>
@@ -1084,7 +1084,7 @@
         <w:rPr>
           <w:noProof/>
         </w:rPr>
-        <w:t>10</w:t>
+        <w:t>16</w:t>
       </w:r>
       <w:r>
         <w:rPr>
@@ -1142,7 +1142,7 @@
         <w:rPr>
           <w:noProof/>
         </w:rPr>
-        <w:t>11</w:t>
+        <w:t>20</w:t>
       </w:r>
       <w:r>
         <w:rPr>
@@ -1200,7 +1200,7 @@
         <w:rPr>
           <w:noProof/>
         </w:rPr>
-        <w:t>12</w:t>
+        <w:t>25</w:t>
       </w:r>
       <w:r>
         <w:rPr>
@@ -1258,7 +1258,7 @@
         <w:rPr>
           <w:noProof/>
         </w:rPr>
-        <w:t>13</w:t>
+        <w:t>29</w:t>
       </w:r>
       <w:r>
         <w:rPr>
@@ -1316,7 +1316,7 @@
         <w:rPr>
           <w:noProof/>
         </w:rPr>
-        <w:t>14</w:t>
+        <w:t>34</w:t>
       </w:r>
       <w:r>
         <w:rPr>
@@ -1374,7 +1374,7 @@
         <w:rPr>
           <w:noProof/>
         </w:rPr>
-        <w:t>15</w:t>
+        <w:t>38</w:t>
       </w:r>
       <w:r>
         <w:rPr>
@@ -32662,6 +32662,23 @@
 </file>
 
 <file path=customXml/item1.xml><?xml version="1.0" encoding="utf-8"?>
+<p:properties xmlns:p="http://schemas.microsoft.com/office/2006/metadata/properties" xmlns:xsi="http://www.w3.org/2001/XMLSchema-instance" xmlns:pc="http://schemas.microsoft.com/office/infopath/2007/PartnerControls">
+  <documentManagement>
+    <_activity xmlns="943299af-12c5-4a94-a2c7-c86c78b36c95" xsi:nil="true"/>
+  </documentManagement>
+</p:properties>
+</file>
+
+<file path=customXml/item2.xml><?xml version="1.0" encoding="utf-8"?>
+<?mso-contentType ?>
+<FormTemplates xmlns="http://schemas.microsoft.com/sharepoint/v3/contenttype/forms">
+  <Display>DocumentLibraryForm</Display>
+  <Edit>DocumentLibraryForm</Edit>
+  <New>DocumentLibraryForm</New>
+</FormTemplates>
+</file>
+
+<file path=customXml/item3.xml><?xml version="1.0" encoding="utf-8"?>
 <ct:contentTypeSchema xmlns:ct="http://schemas.microsoft.com/office/2006/metadata/contentType" xmlns:ma="http://schemas.microsoft.com/office/2006/metadata/properties/metaAttributes" ct:_="" ma:_="" ma:contentTypeName="Document" ma:contentTypeID="0x010100D47E59C22AA6E640B3BDD78573C6C896" ma:contentTypeVersion="15" ma:contentTypeDescription="Create a new document." ma:contentTypeScope="" ma:versionID="ea26a6d382034a4c7c516603d68f0e99">
   <xsd:schema xmlns:xsd="http://www.w3.org/2001/XMLSchema" xmlns:xs="http://www.w3.org/2001/XMLSchema" xmlns:p="http://schemas.microsoft.com/office/2006/metadata/properties" xmlns:ns3="943299af-12c5-4a94-a2c7-c86c78b36c95" xmlns:ns4="4ed9d6d6-5ffe-47a9-86e3-4156f6b81eb7" targetNamespace="http://schemas.microsoft.com/office/2006/metadata/properties" ma:root="true" ma:fieldsID="df250047160caef73d1a3e34c4d7d564" ns3:_="" ns4:_="">
     <xsd:import namespace="943299af-12c5-4a94-a2c7-c86c78b36c95"/>
@@ -32894,24 +32911,25 @@
 </ct:contentTypeSchema>
 </file>
 
-<file path=customXml/item2.xml><?xml version="1.0" encoding="utf-8"?>
-<?mso-contentType ?>
-<FormTemplates xmlns="http://schemas.microsoft.com/sharepoint/v3/contenttype/forms">
-  <Display>DocumentLibraryForm</Display>
-  <Edit>DocumentLibraryForm</Edit>
-  <New>DocumentLibraryForm</New>
-</FormTemplates>
+<file path=customXml/itemProps1.xml><?xml version="1.0" encoding="utf-8"?>
+<ds:datastoreItem xmlns:ds="http://schemas.openxmlformats.org/officeDocument/2006/customXml" ds:itemID="{1D8A0623-92D4-45C4-A124-4ECEE46A8848}">
+  <ds:schemaRefs>
+    <ds:schemaRef ds:uri="http://schemas.microsoft.com/office/2006/metadata/properties"/>
+    <ds:schemaRef ds:uri="http://schemas.microsoft.com/office/infopath/2007/PartnerControls"/>
+    <ds:schemaRef ds:uri="943299af-12c5-4a94-a2c7-c86c78b36c95"/>
+  </ds:schemaRefs>
+</ds:datastoreItem>
 </file>
 
-<file path=customXml/item3.xml><?xml version="1.0" encoding="utf-8"?>
-<p:properties xmlns:p="http://schemas.microsoft.com/office/2006/metadata/properties" xmlns:xsi="http://www.w3.org/2001/XMLSchema-instance" xmlns:pc="http://schemas.microsoft.com/office/infopath/2007/PartnerControls">
-  <documentManagement>
-    <_activity xmlns="943299af-12c5-4a94-a2c7-c86c78b36c95" xsi:nil="true"/>
-  </documentManagement>
-</p:properties>
+<file path=customXml/itemProps2.xml><?xml version="1.0" encoding="utf-8"?>
+<ds:datastoreItem xmlns:ds="http://schemas.openxmlformats.org/officeDocument/2006/customXml" ds:itemID="{021CE650-A287-4318-8E79-4A2262BC584A}">
+  <ds:schemaRefs>
+    <ds:schemaRef ds:uri="http://schemas.microsoft.com/sharepoint/v3/contenttype/forms"/>
+  </ds:schemaRefs>
+</ds:datastoreItem>
 </file>
 
-<file path=customXml/itemProps1.xml><?xml version="1.0" encoding="utf-8"?>
+<file path=customXml/itemProps3.xml><?xml version="1.0" encoding="utf-8"?>
 <ds:datastoreItem xmlns:ds="http://schemas.openxmlformats.org/officeDocument/2006/customXml" ds:itemID="{443D3E7B-EDD1-4C0F-AC82-307385985044}">
   <ds:schemaRefs>
     <ds:schemaRef ds:uri="http://schemas.microsoft.com/office/2006/metadata/contentType"/>
@@ -32928,22 +32946,4 @@
     <ds:schemaRef ds:uri="http://schemas.microsoft.com/internal/obd"/>
   </ds:schemaRefs>
 </ds:datastoreItem>
-</file>
-
-<file path=customXml/itemProps2.xml><?xml version="1.0" encoding="utf-8"?>
-<ds:datastoreItem xmlns:ds="http://schemas.openxmlformats.org/officeDocument/2006/customXml" ds:itemID="{021CE650-A287-4318-8E79-4A2262BC584A}">
-  <ds:schemaRefs>
-    <ds:schemaRef ds:uri="http://schemas.microsoft.com/sharepoint/v3/contenttype/forms"/>
-  </ds:schemaRefs>
-</ds:datastoreItem>
-</file>
-
-<file path=customXml/itemProps3.xml><?xml version="1.0" encoding="utf-8"?>
-<ds:datastoreItem xmlns:ds="http://schemas.openxmlformats.org/officeDocument/2006/customXml" ds:itemID="{1D8A0623-92D4-45C4-A124-4ECEE46A8848}">
-  <ds:schemaRefs>
-    <ds:schemaRef ds:uri="http://schemas.microsoft.com/office/2006/metadata/properties"/>
-    <ds:schemaRef ds:uri="http://schemas.microsoft.com/office/infopath/2007/PartnerControls"/>
-    <ds:schemaRef ds:uri="943299af-12c5-4a94-a2c7-c86c78b36c95"/>
-  </ds:schemaRefs>
-</ds:datastoreItem>
 </file>
</xml_diff>